<commit_message>
Align UX workshop with catalogue-only scope
</commit_message>
<xml_diff>
--- a/docs/atelier-ux-gestionnaires-cash-alimentaire.docx
+++ b/docs/atelier-ux-gestionnaires-cash-alimentaire.docx
@@ -690,7 +690,7 @@
                 <w:color w:val="302828"/>
                 <w:sz w:val="17"/>
               </w:rPr>
-              <w:t>CTA principal</w:t>
+              <w:t>Bouton principal</w:t>
             </w:r>
           </w:p>
         </w:tc>
@@ -785,7 +785,7 @@
                 <w:color w:val="302828"/>
                 <w:sz w:val="17"/>
               </w:rPr>
-              <w:t>CTA secondaire</w:t>
+              <w:t>Bouton secondaire</w:t>
             </w:r>
           </w:p>
         </w:tc>
@@ -3981,7 +3981,7 @@
                 <w:color w:val="302828"/>
                 <w:sz w:val="15"/>
               </w:rPr>
-              <w:t>Galerie à gauche ; identité, format professionnel et CTA à droite.</w:t>
+              <w:t>Galerie à gauche ; identité, format professionnel et bouton de demande à droite.</w:t>
             </w:r>
           </w:p>
         </w:tc>
@@ -4419,7 +4419,7 @@
                 <w:color w:val="302828"/>
                 <w:sz w:val="15"/>
               </w:rPr>
-              <w:t>CTA produit</w:t>
+              <w:t>Bouton produit</w:t>
             </w:r>
           </w:p>
         </w:tc>
@@ -4513,7 +4513,7 @@
                 <w:color w:val="302828"/>
                 <w:sz w:val="15"/>
               </w:rPr>
-              <w:t>CTA global</w:t>
+              <w:t>Bouton global</w:t>
             </w:r>
           </w:p>
         </w:tc>
@@ -5710,57 +5710,7 @@
           <w:color w:val="6B5353"/>
           <w:sz w:val="19"/>
         </w:rPr>
-        <w:t xml:space="preserve">Prix : [ ] masqué  [ ] après connexion  [ ] affiché  </w:t>
-      </w:r>
-      <w:r>
-        <w:rPr>
-          <w:rFonts w:ascii="Calibri" w:hAnsi="Calibri"/>
-          <w:b w:val="0"/>
-          <w:i w:val="0"/>
-          <w:color w:val="302828"/>
-          <w:sz w:val="19"/>
-        </w:rPr>
-        <w:t>______________________________________________________________</w:t>
-      </w:r>
-    </w:p>
-    <w:p>
-      <w:pPr>
-        <w:spacing w:before="0" w:after="20"/>
-      </w:pPr>
-      <w:r>
-        <w:rPr>
-          <w:rFonts w:ascii="Calibri" w:hAnsi="Calibri"/>
-          <w:b/>
-          <w:i w:val="0"/>
-          <w:color w:val="6B5353"/>
-          <w:sz w:val="19"/>
-        </w:rPr>
-        <w:t xml:space="preserve">Disponibilité / stock affiché :  </w:t>
-      </w:r>
-      <w:r>
-        <w:rPr>
-          <w:rFonts w:ascii="Calibri" w:hAnsi="Calibri"/>
-          <w:b w:val="0"/>
-          <w:i w:val="0"/>
-          <w:color w:val="302828"/>
-          <w:sz w:val="19"/>
-        </w:rPr>
-        <w:t>______________________________________________________________</w:t>
-      </w:r>
-    </w:p>
-    <w:p>
-      <w:pPr>
-        <w:spacing w:before="0" w:after="20"/>
-      </w:pPr>
-      <w:r>
-        <w:rPr>
-          <w:rFonts w:ascii="Calibri" w:hAnsi="Calibri"/>
-          <w:b/>
-          <w:i w:val="0"/>
-          <w:color w:val="6B5353"/>
-          <w:sz w:val="19"/>
-        </w:rPr>
-        <w:t xml:space="preserve">CTA produit retenu :  </w:t>
+        <w:t xml:space="preserve">Bouton produit retenu :  </w:t>
       </w:r>
       <w:r>
         <w:rPr>
@@ -7743,7 +7693,7 @@
                 <w:color w:val="302828"/>
                 <w:sz w:val="17"/>
               </w:rPr>
-              <w:t>CTA</w:t>
+              <w:t>Bouton principal</w:t>
             </w:r>
           </w:p>
         </w:tc>
@@ -8050,7 +8000,7 @@
                 <w:color w:val="302828"/>
                 <w:sz w:val="17"/>
               </w:rPr>
-              <w:t>Structure, données et CTA validés</w:t>
+              <w:t>Structure, données et bouton validés</w:t>
             </w:r>
           </w:p>
         </w:tc>

</xml_diff>